<commit_message>
A Lot of Work
</commit_message>
<xml_diff>
--- a/Fredonia Project.docx
+++ b/Fredonia Project.docx
@@ -168,6 +168,7 @@
             <w:dataBinding w:prefixMappings="xmlns:ns0='http://purl.org/dc/elements/1.1/' xmlns:ns1='http://schemas.openxmlformats.org/package/2006/metadata/core-properties' " w:xpath="/ns1:coreProperties[1]/ns0:subject[1]" w:storeItemID="{6C3C8BC8-F283-45AE-878A-BAB7291924A1}"/>
             <w:text/>
           </w:sdtPr>
+          <w:sdtEndPr/>
           <w:sdtContent>
             <w:p>
               <w:pPr>
@@ -282,6 +283,7 @@
                                     <w:calendar w:val="gregorian"/>
                                   </w:date>
                                 </w:sdtPr>
+                                <w:sdtEndPr/>
                                 <w:sdtContent>
                                   <w:p>
                                     <w:pPr>
@@ -327,6 +329,7 @@
                                     <w:dataBinding w:prefixMappings="xmlns:ns0='http://schemas.openxmlformats.org/officeDocument/2006/extended-properties' " w:xpath="/ns0:Properties[1]/ns0:Company[1]" w:storeItemID="{6668398D-A668-4E3E-A5EB-62B293D839F1}"/>
                                     <w:text/>
                                   </w:sdtPr>
+                                  <w:sdtEndPr/>
                                   <w:sdtContent>
                                     <w:r>
                                       <w:rPr>
@@ -357,6 +360,7 @@
                                     <w:dataBinding w:prefixMappings="xmlns:ns0='http://schemas.microsoft.com/office/2006/coverPageProps' " w:xpath="/ns0:CoverPageProperties[1]/ns0:CompanyAddress[1]" w:storeItemID="{55AF091B-3C7A-41E3-B477-F2FDAA23CFDA}"/>
                                     <w:text/>
                                   </w:sdtPr>
+                                  <w:sdtEndPr/>
                                   <w:sdtContent>
                                     <w:r>
                                       <w:rPr>
@@ -415,6 +419,7 @@
                               <w:calendar w:val="gregorian"/>
                             </w:date>
                           </w:sdtPr>
+                          <w:sdtEndPr/>
                           <w:sdtContent>
                             <w:p>
                               <w:pPr>
@@ -460,6 +465,7 @@
                               <w:dataBinding w:prefixMappings="xmlns:ns0='http://schemas.openxmlformats.org/officeDocument/2006/extended-properties' " w:xpath="/ns0:Properties[1]/ns0:Company[1]" w:storeItemID="{6668398D-A668-4E3E-A5EB-62B293D839F1}"/>
                               <w:text/>
                             </w:sdtPr>
+                            <w:sdtEndPr/>
                             <w:sdtContent>
                               <w:r>
                                 <w:rPr>
@@ -490,6 +496,7 @@
                               <w:dataBinding w:prefixMappings="xmlns:ns0='http://schemas.microsoft.com/office/2006/coverPageProps' " w:xpath="/ns0:CoverPageProperties[1]/ns0:CompanyAddress[1]" w:storeItemID="{55AF091B-3C7A-41E3-B477-F2FDAA23CFDA}"/>
                               <w:text/>
                             </w:sdtPr>
+                            <w:sdtEndPr/>
                             <w:sdtContent>
                               <w:r>
                                 <w:rPr>
@@ -579,6 +586,14 @@
     </w:sdt>
     <w:sdt>
       <w:sdtPr>
+        <w:rPr>
+          <w:rFonts w:ascii="Times New Roman" w:eastAsiaTheme="minorHAnsi" w:hAnsi="Times New Roman" w:cs="Times New Roman"/>
+          <w:color w:val="auto"/>
+          <w:kern w:val="2"/>
+          <w:sz w:val="24"/>
+          <w:szCs w:val="24"/>
+          <w14:ligatures w14:val="standardContextual"/>
+        </w:rPr>
         <w:id w:val="319170215"/>
         <w:docPartObj>
           <w:docPartGallery w:val="Table of Contents"/>
@@ -587,15 +602,9 @@
       </w:sdtPr>
       <w:sdtEndPr>
         <w:rPr>
-          <w:rFonts w:ascii="Times New Roman" w:eastAsiaTheme="minorHAnsi" w:hAnsi="Times New Roman" w:cs="Times New Roman"/>
           <w:b/>
           <w:bCs/>
           <w:noProof/>
-          <w:color w:val="auto"/>
-          <w:kern w:val="2"/>
-          <w:sz w:val="24"/>
-          <w:szCs w:val="24"/>
-          <w14:ligatures w14:val="standardContextual"/>
         </w:rPr>
       </w:sdtEndPr>
       <w:sdtContent>
@@ -1553,10 +1562,25 @@
       </w:hyperlink>
     </w:p>
     <w:p/>
+    <w:p>
+      <w:r>
+        <w:t>Used for making a statistically accurate model:</w:t>
+      </w:r>
+    </w:p>
+    <w:p>
+      <w:hyperlink r:id="rId14" w:history="1">
+        <w:r>
+          <w:rPr>
+            <w:rStyle w:val="Hyperlink"/>
+          </w:rPr>
+          <w:t>https://www.dot.ny.gov/tdv</w:t>
+        </w:r>
+      </w:hyperlink>
+    </w:p>
     <w:p/>
     <w:sectPr>
-      <w:footerReference w:type="even" r:id="rId14"/>
-      <w:footerReference w:type="default" r:id="rId15"/>
+      <w:footerReference w:type="even" r:id="rId15"/>
+      <w:footerReference w:type="default" r:id="rId16"/>
       <w:pgSz w:w="12240" w:h="15840"/>
       <w:pgMar w:top="1440" w:right="1440" w:bottom="1440" w:left="1440" w:header="720" w:footer="720" w:gutter="0"/>
       <w:pgNumType w:start="0"/>
@@ -3167,6 +3191,7 @@
   <w:rsids>
     <w:rsidRoot w:val="00A57505"/>
     <w:rsid w:val="00127B76"/>
+    <w:rsid w:val="00300F3E"/>
     <w:rsid w:val="0069569C"/>
     <w:rsid w:val="007B0D02"/>
     <w:rsid w:val="008636F2"/>
@@ -3176,6 +3201,7 @@
     <w:rsid w:val="00C25F99"/>
     <w:rsid w:val="00CD19A3"/>
     <w:rsid w:val="00EE331B"/>
+    <w:rsid w:val="00F3398D"/>
     <w:rsid w:val="00F50114"/>
     <w:rsid w:val="00FE2913"/>
   </w:rsids>
@@ -3636,18 +3662,6 @@
     <w:name w:val="2C3FE60C84DD4FF5A99A4034E30344E1"/>
     <w:rsid w:val="00A57505"/>
   </w:style>
-  <w:style w:type="paragraph" w:customStyle="1" w:styleId="7104E9836FE545919BE873EA3DE38D25">
-    <w:name w:val="7104E9836FE545919BE873EA3DE38D25"/>
-    <w:rsid w:val="00A57505"/>
-  </w:style>
-  <w:style w:type="paragraph" w:customStyle="1" w:styleId="686DC4DA275046DEA784AF9BD012FC8B">
-    <w:name w:val="686DC4DA275046DEA784AF9BD012FC8B"/>
-    <w:rsid w:val="00A57505"/>
-  </w:style>
-  <w:style w:type="paragraph" w:customStyle="1" w:styleId="5EC349BE8A5D448BA3E5E0C6909D9791">
-    <w:name w:val="5EC349BE8A5D448BA3E5E0C6909D9791"/>
-    <w:rsid w:val="00A57505"/>
-  </w:style>
 </w:styles>
 </file>
 

</xml_diff>